<commit_message>
Learned the basics of pandas
</commit_message>
<xml_diff>
--- a/Day15(Learning Pandas)/Cheat Sheet for Pandas.docx
+++ b/Day15(Learning Pandas)/Cheat Sheet for Pandas.docx
@@ -1,6 +1,6 @@
 
 <file path=word/document.xml><?xml version="1.0" encoding="utf-8"?>
-<w:document xmlns:wpc="http://schemas.microsoft.com/office/word/2010/wordprocessingCanvas" xmlns:cx="http://schemas.microsoft.com/office/drawing/2014/chartex" xmlns:cx1="http://schemas.microsoft.com/office/drawing/2015/9/8/chartex" xmlns:cx2="http://schemas.microsoft.com/office/drawing/2015/10/21/chartex" xmlns:cx3="http://schemas.microsoft.com/office/drawing/2016/5/9/chartex" xmlns:cx4="http://schemas.microsoft.com/office/drawing/2016/5/10/chartex" xmlns:cx5="http://schemas.microsoft.com/office/drawing/2016/5/11/chartex" xmlns:cx6="http://schemas.microsoft.com/office/drawing/2016/5/12/chartex" xmlns:cx7="http://schemas.microsoft.com/office/drawing/2016/5/13/chartex" xmlns:cx8="http://schemas.microsoft.com/office/drawing/2016/5/14/chartex" xmlns:mc="http://schemas.openxmlformats.org/markup-compatibility/2006" xmlns:aink="http://schemas.microsoft.com/office/drawing/2016/ink" xmlns:am3d="http://schemas.microsoft.com/office/drawing/2017/model3d" xmlns:o="urn:schemas-microsoft-com:office:office" xmlns:oel="http://schemas.microsoft.com/office/2019/extlst" xmlns:r="http://schemas.openxmlformats.org/officeDocument/2006/relationships" xmlns:m="http://schemas.openxmlformats.org/officeDocument/2006/math" xmlns:v="urn:schemas-microsoft-com:vml" xmlns:wp14="http://schemas.microsoft.com/office/word/2010/wordprocessingDrawing" xmlns:wp="http://schemas.openxmlformats.org/drawingml/2006/wordprocessingDrawing" xmlns:w10="urn:schemas-microsoft-com:office:word" xmlns:w="http://schemas.openxmlformats.org/wordprocessingml/2006/main" xmlns:w14="http://schemas.microsoft.com/office/word/2010/wordml" xmlns:w15="http://schemas.microsoft.com/office/word/2012/wordml" xmlns:w16cex="http://schemas.microsoft.com/office/word/2018/wordml/cex" xmlns:w16cid="http://schemas.microsoft.com/office/word/2016/wordml/cid" xmlns:w16="http://schemas.microsoft.com/office/word/2018/wordml" xmlns:w16du="http://schemas.microsoft.com/office/word/2023/wordml/word16du" xmlns:w16sdtdh="http://schemas.microsoft.com/office/word/2020/wordml/sdtdatahash" xmlns:w16sdtfl="http://schemas.microsoft.com/office/word/2024/wordml/sdtformatlock" xmlns:w16se="http://schemas.microsoft.com/office/word/2015/wordml/symex" xmlns:wpg="http://schemas.microsoft.com/office/word/2010/wordprocessingGroup" xmlns:wpi="http://schemas.microsoft.com/office/word/2010/wordprocessingInk" xmlns:wne="http://schemas.microsoft.com/office/word/2006/wordml" xmlns:wps="http://schemas.microsoft.com/office/word/2010/wordprocessingShape" mc:Ignorable="w14 w15 w16se w16cid w16 w16cex w16sdtdh w16sdtfl w16du wp14">
+<w:document xmlns:wpc="http://schemas.microsoft.com/office/word/2010/wordprocessingCanvas" xmlns:cx="http://schemas.microsoft.com/office/drawing/2014/chartex" xmlns:cx1="http://schemas.microsoft.com/office/drawing/2015/9/8/chartex" xmlns:mc="http://schemas.openxmlformats.org/markup-compatibility/2006" xmlns:o="urn:schemas-microsoft-com:office:office" xmlns:r="http://schemas.openxmlformats.org/officeDocument/2006/relationships" xmlns:m="http://schemas.openxmlformats.org/officeDocument/2006/math" xmlns:v="urn:schemas-microsoft-com:vml" xmlns:wp14="http://schemas.microsoft.com/office/word/2010/wordprocessingDrawing" xmlns:wp="http://schemas.openxmlformats.org/drawingml/2006/wordprocessingDrawing" xmlns:w10="urn:schemas-microsoft-com:office:word" xmlns:w="http://schemas.openxmlformats.org/wordprocessingml/2006/main" xmlns:w14="http://schemas.microsoft.com/office/word/2010/wordml" xmlns:w15="http://schemas.microsoft.com/office/word/2012/wordml" xmlns:w16se="http://schemas.microsoft.com/office/word/2015/wordml/symex" xmlns:wpg="http://schemas.microsoft.com/office/word/2010/wordprocessingGroup" xmlns:wpi="http://schemas.microsoft.com/office/word/2010/wordprocessingInk" xmlns:wne="http://schemas.microsoft.com/office/word/2006/wordml" xmlns:wps="http://schemas.microsoft.com/office/word/2010/wordprocessingShape" mc:Ignorable="w14 w15 w16se wp14">
   <w:body>
     <w:p>
       <w:pPr>
@@ -520,15 +520,102 @@
           <w:szCs w:val="44"/>
         </w:rPr>
       </w:pPr>
-      <w:r>
-        <w:rPr>
-          <w:rFonts w:ascii="Amasis MT Pro Black" w:hAnsi="Amasis MT Pro Black"/>
-          <w:b/>
-          <w:bCs/>
-          <w:color w:val="5B9BD5" w:themeColor="accent1"/>
-          <w:sz w:val="44"/>
-          <w:szCs w:val="44"/>
-        </w:rPr>
+    </w:p>
+    <w:p>
+      <w:pPr>
+        <w:rPr>
+          <w:rFonts w:ascii="Amasis MT Pro Black" w:hAnsi="Amasis MT Pro Black"/>
+          <w:b/>
+          <w:bCs/>
+          <w:color w:val="5B9BD5" w:themeColor="accent1"/>
+          <w:sz w:val="44"/>
+          <w:szCs w:val="44"/>
+        </w:rPr>
+      </w:pPr>
+    </w:p>
+    <w:p>
+      <w:pPr>
+        <w:rPr>
+          <w:rFonts w:ascii="Amasis MT Pro Black" w:hAnsi="Amasis MT Pro Black"/>
+          <w:b/>
+          <w:bCs/>
+          <w:color w:val="5B9BD5" w:themeColor="accent1"/>
+          <w:sz w:val="44"/>
+          <w:szCs w:val="44"/>
+        </w:rPr>
+      </w:pPr>
+    </w:p>
+    <w:p>
+      <w:pPr>
+        <w:rPr>
+          <w:rFonts w:ascii="Amasis MT Pro Black" w:hAnsi="Amasis MT Pro Black"/>
+          <w:b/>
+          <w:bCs/>
+          <w:color w:val="5B9BD5" w:themeColor="accent1"/>
+          <w:sz w:val="44"/>
+          <w:szCs w:val="44"/>
+        </w:rPr>
+      </w:pPr>
+    </w:p>
+    <w:p>
+      <w:pPr>
+        <w:rPr>
+          <w:rFonts w:ascii="Amasis MT Pro Black" w:hAnsi="Amasis MT Pro Black"/>
+          <w:b/>
+          <w:bCs/>
+          <w:color w:val="5B9BD5" w:themeColor="accent1"/>
+          <w:sz w:val="44"/>
+          <w:szCs w:val="44"/>
+        </w:rPr>
+      </w:pPr>
+    </w:p>
+    <w:p>
+      <w:pPr>
+        <w:rPr>
+          <w:rFonts w:ascii="Amasis MT Pro Black" w:hAnsi="Amasis MT Pro Black"/>
+          <w:b/>
+          <w:bCs/>
+          <w:color w:val="5B9BD5" w:themeColor="accent1"/>
+          <w:sz w:val="44"/>
+          <w:szCs w:val="44"/>
+        </w:rPr>
+      </w:pPr>
+    </w:p>
+    <w:p>
+      <w:pPr>
+        <w:rPr>
+          <w:rFonts w:ascii="Amasis MT Pro Black" w:hAnsi="Amasis MT Pro Black"/>
+          <w:b/>
+          <w:bCs/>
+          <w:color w:val="5B9BD5" w:themeColor="accent1"/>
+          <w:sz w:val="44"/>
+          <w:szCs w:val="44"/>
+        </w:rPr>
+      </w:pPr>
+    </w:p>
+    <w:p>
+      <w:pPr>
+        <w:rPr>
+          <w:rFonts w:ascii="Amasis MT Pro Black" w:hAnsi="Amasis MT Pro Black"/>
+          <w:b/>
+          <w:bCs/>
+          <w:color w:val="5B9BD5" w:themeColor="accent1"/>
+          <w:sz w:val="44"/>
+          <w:szCs w:val="44"/>
+        </w:rPr>
+      </w:pPr>
+      <w:bookmarkStart w:id="0" w:name="_GoBack"/>
+      <w:bookmarkEnd w:id="0"/>
+      <w:r>
+        <w:rPr>
+          <w:rFonts w:ascii="Amasis MT Pro Black" w:hAnsi="Amasis MT Pro Black"/>
+          <w:b/>
+          <w:bCs/>
+          <w:color w:val="5B9BD5" w:themeColor="accent1"/>
+          <w:sz w:val="44"/>
+          <w:szCs w:val="44"/>
+        </w:rPr>
+        <w:lastRenderedPageBreak/>
         <w:t>Count values by Category in pandas</w:t>
       </w:r>
       <w:r>
@@ -564,7 +651,6 @@
           <w:sz w:val="44"/>
           <w:szCs w:val="44"/>
         </w:rPr>
-        <w:lastRenderedPageBreak/>
         <w:drawing>
           <wp:inline distT="0" distB="0" distL="0" distR="0" wp14:anchorId="20DD2EC0" wp14:editId="54D13594">
             <wp:extent cx="5943600" cy="2252345"/>
@@ -765,6 +851,311 @@
         </w:drawing>
       </w:r>
     </w:p>
+    <w:p>
+      <w:pPr>
+        <w:rPr>
+          <w:rFonts w:ascii="Amasis MT Pro Black" w:hAnsi="Amasis MT Pro Black"/>
+          <w:b/>
+          <w:bCs/>
+          <w:color w:val="5B9BD5" w:themeColor="accent1"/>
+          <w:sz w:val="44"/>
+          <w:szCs w:val="44"/>
+        </w:rPr>
+      </w:pPr>
+    </w:p>
+    <w:p>
+      <w:pPr>
+        <w:rPr>
+          <w:rFonts w:ascii="Amasis MT Pro Black" w:hAnsi="Amasis MT Pro Black"/>
+          <w:b/>
+          <w:bCs/>
+          <w:color w:val="5B9BD5" w:themeColor="accent1"/>
+          <w:sz w:val="44"/>
+          <w:szCs w:val="44"/>
+        </w:rPr>
+      </w:pPr>
+    </w:p>
+    <w:p>
+      <w:pPr>
+        <w:rPr>
+          <w:rFonts w:ascii="Amasis MT Pro Black" w:hAnsi="Amasis MT Pro Black"/>
+          <w:b/>
+          <w:bCs/>
+          <w:color w:val="5B9BD5" w:themeColor="accent1"/>
+          <w:sz w:val="44"/>
+          <w:szCs w:val="44"/>
+        </w:rPr>
+      </w:pPr>
+    </w:p>
+    <w:p>
+      <w:pPr>
+        <w:rPr>
+          <w:rFonts w:ascii="Amasis MT Pro Black" w:hAnsi="Amasis MT Pro Black"/>
+          <w:b/>
+          <w:bCs/>
+          <w:color w:val="5B9BD5" w:themeColor="accent1"/>
+          <w:sz w:val="44"/>
+          <w:szCs w:val="44"/>
+        </w:rPr>
+      </w:pPr>
+    </w:p>
+    <w:p>
+      <w:pPr>
+        <w:rPr>
+          <w:rFonts w:ascii="Amasis MT Pro Black" w:hAnsi="Amasis MT Pro Black"/>
+          <w:b/>
+          <w:bCs/>
+          <w:color w:val="5B9BD5" w:themeColor="accent1"/>
+          <w:sz w:val="44"/>
+          <w:szCs w:val="44"/>
+        </w:rPr>
+      </w:pPr>
+    </w:p>
+    <w:p>
+      <w:pPr>
+        <w:rPr>
+          <w:rFonts w:ascii="Amasis MT Pro Black" w:hAnsi="Amasis MT Pro Black"/>
+          <w:b/>
+          <w:bCs/>
+          <w:color w:val="5B9BD5" w:themeColor="accent1"/>
+          <w:sz w:val="44"/>
+          <w:szCs w:val="44"/>
+        </w:rPr>
+      </w:pPr>
+      <w:r>
+        <w:rPr>
+          <w:rFonts w:ascii="Amasis MT Pro Black" w:hAnsi="Amasis MT Pro Black"/>
+          <w:b/>
+          <w:bCs/>
+          <w:color w:val="5B9BD5" w:themeColor="accent1"/>
+          <w:sz w:val="44"/>
+          <w:szCs w:val="44"/>
+        </w:rPr>
+        <w:lastRenderedPageBreak/>
+        <w:t>Set index and sort index methods:</w:t>
+      </w:r>
+    </w:p>
+    <w:p>
+      <w:pPr>
+        <w:rPr>
+          <w:rFonts w:ascii="Amasis MT Pro Black" w:hAnsi="Amasis MT Pro Black"/>
+          <w:b/>
+          <w:bCs/>
+          <w:color w:val="5B9BD5" w:themeColor="accent1"/>
+          <w:sz w:val="44"/>
+          <w:szCs w:val="44"/>
+        </w:rPr>
+      </w:pPr>
+      <w:r>
+        <w:rPr>
+          <w:rFonts w:ascii="Amasis MT Pro Black" w:hAnsi="Amasis MT Pro Black"/>
+          <w:b/>
+          <w:bCs/>
+          <w:noProof/>
+          <w:color w:val="5B9BD5" w:themeColor="accent1"/>
+          <w:sz w:val="44"/>
+          <w:szCs w:val="44"/>
+        </w:rPr>
+        <w:drawing>
+          <wp:inline distT="0" distB="0" distL="0" distR="0" wp14:anchorId="00554BF6" wp14:editId="5D6A8318">
+            <wp:extent cx="5952226" cy="4207896"/>
+            <wp:effectExtent l="0" t="0" r="0" b="2540"/>
+            <wp:docPr id="1" name="Picture 1"/>
+            <wp:cNvGraphicFramePr>
+              <a:graphicFrameLocks xmlns:a="http://schemas.openxmlformats.org/drawingml/2006/main" noChangeAspect="1"/>
+            </wp:cNvGraphicFramePr>
+            <a:graphic xmlns:a="http://schemas.openxmlformats.org/drawingml/2006/main">
+              <a:graphicData uri="http://schemas.openxmlformats.org/drawingml/2006/picture">
+                <pic:pic xmlns:pic="http://schemas.openxmlformats.org/drawingml/2006/picture">
+                  <pic:nvPicPr>
+                    <pic:cNvPr id="1" name="Screenshot 2025-07-20 144141.png"/>
+                    <pic:cNvPicPr/>
+                  </pic:nvPicPr>
+                  <pic:blipFill>
+                    <a:blip r:embed="rId18">
+                      <a:extLst>
+                        <a:ext uri="{28A0092B-C50C-407E-A947-70E740481C1C}">
+                          <a14:useLocalDpi xmlns:a14="http://schemas.microsoft.com/office/drawing/2010/main" val="0"/>
+                        </a:ext>
+                      </a:extLst>
+                    </a:blip>
+                    <a:stretch>
+                      <a:fillRect/>
+                    </a:stretch>
+                  </pic:blipFill>
+                  <pic:spPr>
+                    <a:xfrm>
+                      <a:off x="0" y="0"/>
+                      <a:ext cx="5988754" cy="4233719"/>
+                    </a:xfrm>
+                    <a:prstGeom prst="rect">
+                      <a:avLst/>
+                    </a:prstGeom>
+                  </pic:spPr>
+                </pic:pic>
+              </a:graphicData>
+            </a:graphic>
+          </wp:inline>
+        </w:drawing>
+      </w:r>
+      <w:r>
+        <w:rPr>
+          <w:rFonts w:ascii="Amasis MT Pro Black" w:hAnsi="Amasis MT Pro Black"/>
+          <w:b/>
+          <w:bCs/>
+          <w:noProof/>
+          <w:color w:val="5B9BD5" w:themeColor="accent1"/>
+          <w:sz w:val="44"/>
+          <w:szCs w:val="44"/>
+        </w:rPr>
+        <w:drawing>
+          <wp:inline distT="0" distB="0" distL="0" distR="0" wp14:anchorId="318557A6" wp14:editId="35FB34F2">
+            <wp:extent cx="5943600" cy="1754505"/>
+            <wp:effectExtent l="0" t="0" r="0" b="0"/>
+            <wp:docPr id="2" name="Picture 2"/>
+            <wp:cNvGraphicFramePr>
+              <a:graphicFrameLocks xmlns:a="http://schemas.openxmlformats.org/drawingml/2006/main" noChangeAspect="1"/>
+            </wp:cNvGraphicFramePr>
+            <a:graphic xmlns:a="http://schemas.openxmlformats.org/drawingml/2006/main">
+              <a:graphicData uri="http://schemas.openxmlformats.org/drawingml/2006/picture">
+                <pic:pic xmlns:pic="http://schemas.openxmlformats.org/drawingml/2006/picture">
+                  <pic:nvPicPr>
+                    <pic:cNvPr id="2" name="Screenshot 2025-07-20 144308.png"/>
+                    <pic:cNvPicPr/>
+                  </pic:nvPicPr>
+                  <pic:blipFill>
+                    <a:blip r:embed="rId19">
+                      <a:extLst>
+                        <a:ext uri="{28A0092B-C50C-407E-A947-70E740481C1C}">
+                          <a14:useLocalDpi xmlns:a14="http://schemas.microsoft.com/office/drawing/2010/main" val="0"/>
+                        </a:ext>
+                      </a:extLst>
+                    </a:blip>
+                    <a:stretch>
+                      <a:fillRect/>
+                    </a:stretch>
+                  </pic:blipFill>
+                  <pic:spPr>
+                    <a:xfrm>
+                      <a:off x="0" y="0"/>
+                      <a:ext cx="5943600" cy="1754505"/>
+                    </a:xfrm>
+                    <a:prstGeom prst="rect">
+                      <a:avLst/>
+                    </a:prstGeom>
+                  </pic:spPr>
+                </pic:pic>
+              </a:graphicData>
+            </a:graphic>
+          </wp:inline>
+        </w:drawing>
+      </w:r>
+      <w:r>
+        <w:rPr>
+          <w:rFonts w:ascii="Amasis MT Pro Black" w:hAnsi="Amasis MT Pro Black"/>
+          <w:b/>
+          <w:bCs/>
+          <w:noProof/>
+          <w:color w:val="5B9BD5" w:themeColor="accent1"/>
+          <w:sz w:val="44"/>
+          <w:szCs w:val="44"/>
+        </w:rPr>
+        <w:lastRenderedPageBreak/>
+        <w:drawing>
+          <wp:inline distT="0" distB="0" distL="0" distR="0" wp14:anchorId="03C24CDE" wp14:editId="012AF817">
+            <wp:extent cx="5943600" cy="3944620"/>
+            <wp:effectExtent l="0" t="0" r="0" b="0"/>
+            <wp:docPr id="3" name="Picture 3"/>
+            <wp:cNvGraphicFramePr>
+              <a:graphicFrameLocks xmlns:a="http://schemas.openxmlformats.org/drawingml/2006/main" noChangeAspect="1"/>
+            </wp:cNvGraphicFramePr>
+            <a:graphic xmlns:a="http://schemas.openxmlformats.org/drawingml/2006/main">
+              <a:graphicData uri="http://schemas.openxmlformats.org/drawingml/2006/picture">
+                <pic:pic xmlns:pic="http://schemas.openxmlformats.org/drawingml/2006/picture">
+                  <pic:nvPicPr>
+                    <pic:cNvPr id="3" name="Screenshot 2025-07-20 144328.png"/>
+                    <pic:cNvPicPr/>
+                  </pic:nvPicPr>
+                  <pic:blipFill>
+                    <a:blip r:embed="rId20">
+                      <a:extLst>
+                        <a:ext uri="{28A0092B-C50C-407E-A947-70E740481C1C}">
+                          <a14:useLocalDpi xmlns:a14="http://schemas.microsoft.com/office/drawing/2010/main" val="0"/>
+                        </a:ext>
+                      </a:extLst>
+                    </a:blip>
+                    <a:stretch>
+                      <a:fillRect/>
+                    </a:stretch>
+                  </pic:blipFill>
+                  <pic:spPr>
+                    <a:xfrm>
+                      <a:off x="0" y="0"/>
+                      <a:ext cx="5943600" cy="3944620"/>
+                    </a:xfrm>
+                    <a:prstGeom prst="rect">
+                      <a:avLst/>
+                    </a:prstGeom>
+                  </pic:spPr>
+                </pic:pic>
+              </a:graphicData>
+            </a:graphic>
+          </wp:inline>
+        </w:drawing>
+      </w:r>
+      <w:r>
+        <w:rPr>
+          <w:rFonts w:ascii="Amasis MT Pro Black" w:hAnsi="Amasis MT Pro Black"/>
+          <w:b/>
+          <w:bCs/>
+          <w:noProof/>
+          <w:color w:val="5B9BD5" w:themeColor="accent1"/>
+          <w:sz w:val="44"/>
+          <w:szCs w:val="44"/>
+        </w:rPr>
+        <w:drawing>
+          <wp:inline distT="0" distB="0" distL="0" distR="0" wp14:anchorId="690745A3" wp14:editId="03680E85">
+            <wp:extent cx="5943600" cy="1861185"/>
+            <wp:effectExtent l="0" t="0" r="0" b="5715"/>
+            <wp:docPr id="4" name="Picture 4"/>
+            <wp:cNvGraphicFramePr>
+              <a:graphicFrameLocks xmlns:a="http://schemas.openxmlformats.org/drawingml/2006/main" noChangeAspect="1"/>
+            </wp:cNvGraphicFramePr>
+            <a:graphic xmlns:a="http://schemas.openxmlformats.org/drawingml/2006/main">
+              <a:graphicData uri="http://schemas.openxmlformats.org/drawingml/2006/picture">
+                <pic:pic xmlns:pic="http://schemas.openxmlformats.org/drawingml/2006/picture">
+                  <pic:nvPicPr>
+                    <pic:cNvPr id="4" name="Screenshot 2025-07-20 144339.png"/>
+                    <pic:cNvPicPr/>
+                  </pic:nvPicPr>
+                  <pic:blipFill>
+                    <a:blip r:embed="rId21">
+                      <a:extLst>
+                        <a:ext uri="{28A0092B-C50C-407E-A947-70E740481C1C}">
+                          <a14:useLocalDpi xmlns:a14="http://schemas.microsoft.com/office/drawing/2010/main" val="0"/>
+                        </a:ext>
+                      </a:extLst>
+                    </a:blip>
+                    <a:stretch>
+                      <a:fillRect/>
+                    </a:stretch>
+                  </pic:blipFill>
+                  <pic:spPr>
+                    <a:xfrm>
+                      <a:off x="0" y="0"/>
+                      <a:ext cx="5943600" cy="1861185"/>
+                    </a:xfrm>
+                    <a:prstGeom prst="rect">
+                      <a:avLst/>
+                    </a:prstGeom>
+                  </pic:spPr>
+                </pic:pic>
+              </a:graphicData>
+            </a:graphic>
+          </wp:inline>
+        </w:drawing>
+      </w:r>
+    </w:p>
     <w:sectPr>
       <w:pgSz w:w="12240" w:h="15840"/>
       <w:pgMar w:top="1440" w:right="1440" w:bottom="1440" w:left="1440" w:header="720" w:footer="720" w:gutter="0"/>
@@ -776,7 +1167,7 @@
 </file>
 
 <file path=word/endnotes.xml><?xml version="1.0" encoding="utf-8"?>
-<w:endnotes xmlns:wpc="http://schemas.microsoft.com/office/word/2010/wordprocessingCanvas" xmlns:cx="http://schemas.microsoft.com/office/drawing/2014/chartex" xmlns:cx1="http://schemas.microsoft.com/office/drawing/2015/9/8/chartex" xmlns:cx2="http://schemas.microsoft.com/office/drawing/2015/10/21/chartex" xmlns:cx3="http://schemas.microsoft.com/office/drawing/2016/5/9/chartex" xmlns:cx4="http://schemas.microsoft.com/office/drawing/2016/5/10/chartex" xmlns:cx5="http://schemas.microsoft.com/office/drawing/2016/5/11/chartex" xmlns:cx6="http://schemas.microsoft.com/office/drawing/2016/5/12/chartex" xmlns:cx7="http://schemas.microsoft.com/office/drawing/2016/5/13/chartex" xmlns:cx8="http://schemas.microsoft.com/office/drawing/2016/5/14/chartex" xmlns:mc="http://schemas.openxmlformats.org/markup-compatibility/2006" xmlns:aink="http://schemas.microsoft.com/office/drawing/2016/ink" xmlns:am3d="http://schemas.microsoft.com/office/drawing/2017/model3d" xmlns:o="urn:schemas-microsoft-com:office:office" xmlns:oel="http://schemas.microsoft.com/office/2019/extlst" xmlns:r="http://schemas.openxmlformats.org/officeDocument/2006/relationships" xmlns:m="http://schemas.openxmlformats.org/officeDocument/2006/math" xmlns:v="urn:schemas-microsoft-com:vml" xmlns:wp14="http://schemas.microsoft.com/office/word/2010/wordprocessingDrawing" xmlns:wp="http://schemas.openxmlformats.org/drawingml/2006/wordprocessingDrawing" xmlns:w10="urn:schemas-microsoft-com:office:word" xmlns:w="http://schemas.openxmlformats.org/wordprocessingml/2006/main" xmlns:w14="http://schemas.microsoft.com/office/word/2010/wordml" xmlns:w15="http://schemas.microsoft.com/office/word/2012/wordml" xmlns:w16cex="http://schemas.microsoft.com/office/word/2018/wordml/cex" xmlns:w16cid="http://schemas.microsoft.com/office/word/2016/wordml/cid" xmlns:w16="http://schemas.microsoft.com/office/word/2018/wordml" xmlns:w16du="http://schemas.microsoft.com/office/word/2023/wordml/word16du" xmlns:w16sdtdh="http://schemas.microsoft.com/office/word/2020/wordml/sdtdatahash" xmlns:w16sdtfl="http://schemas.microsoft.com/office/word/2024/wordml/sdtformatlock" xmlns:w16se="http://schemas.microsoft.com/office/word/2015/wordml/symex" xmlns:wpg="http://schemas.microsoft.com/office/word/2010/wordprocessingGroup" xmlns:wpi="http://schemas.microsoft.com/office/word/2010/wordprocessingInk" xmlns:wne="http://schemas.microsoft.com/office/word/2006/wordml" xmlns:wps="http://schemas.microsoft.com/office/word/2010/wordprocessingShape" mc:Ignorable="w14 w15 w16se w16cid w16 w16cex w16sdtdh w16sdtfl w16du wp14">
+<w:endnotes xmlns:wpc="http://schemas.microsoft.com/office/word/2010/wordprocessingCanvas" xmlns:cx="http://schemas.microsoft.com/office/drawing/2014/chartex" xmlns:cx1="http://schemas.microsoft.com/office/drawing/2015/9/8/chartex" xmlns:mc="http://schemas.openxmlformats.org/markup-compatibility/2006" xmlns:o="urn:schemas-microsoft-com:office:office" xmlns:r="http://schemas.openxmlformats.org/officeDocument/2006/relationships" xmlns:m="http://schemas.openxmlformats.org/officeDocument/2006/math" xmlns:v="urn:schemas-microsoft-com:vml" xmlns:wp14="http://schemas.microsoft.com/office/word/2010/wordprocessingDrawing" xmlns:wp="http://schemas.openxmlformats.org/drawingml/2006/wordprocessingDrawing" xmlns:w10="urn:schemas-microsoft-com:office:word" xmlns:w="http://schemas.openxmlformats.org/wordprocessingml/2006/main" xmlns:w14="http://schemas.microsoft.com/office/word/2010/wordml" xmlns:w15="http://schemas.microsoft.com/office/word/2012/wordml" xmlns:w16se="http://schemas.microsoft.com/office/word/2015/wordml/symex" xmlns:wpg="http://schemas.microsoft.com/office/word/2010/wordprocessingGroup" xmlns:wpi="http://schemas.microsoft.com/office/word/2010/wordprocessingInk" xmlns:wne="http://schemas.microsoft.com/office/word/2006/wordml" xmlns:wps="http://schemas.microsoft.com/office/word/2010/wordprocessingShape" mc:Ignorable="w14 w15 w16se wp14">
   <w:endnote w:type="separator" w:id="-1">
     <w:p>
       <w:pPr>
@@ -801,7 +1192,7 @@
 </file>
 
 <file path=word/footnotes.xml><?xml version="1.0" encoding="utf-8"?>
-<w:footnotes xmlns:wpc="http://schemas.microsoft.com/office/word/2010/wordprocessingCanvas" xmlns:cx="http://schemas.microsoft.com/office/drawing/2014/chartex" xmlns:cx1="http://schemas.microsoft.com/office/drawing/2015/9/8/chartex" xmlns:cx2="http://schemas.microsoft.com/office/drawing/2015/10/21/chartex" xmlns:cx3="http://schemas.microsoft.com/office/drawing/2016/5/9/chartex" xmlns:cx4="http://schemas.microsoft.com/office/drawing/2016/5/10/chartex" xmlns:cx5="http://schemas.microsoft.com/office/drawing/2016/5/11/chartex" xmlns:cx6="http://schemas.microsoft.com/office/drawing/2016/5/12/chartex" xmlns:cx7="http://schemas.microsoft.com/office/drawing/2016/5/13/chartex" xmlns:cx8="http://schemas.microsoft.com/office/drawing/2016/5/14/chartex" xmlns:mc="http://schemas.openxmlformats.org/markup-compatibility/2006" xmlns:aink="http://schemas.microsoft.com/office/drawing/2016/ink" xmlns:am3d="http://schemas.microsoft.com/office/drawing/2017/model3d" xmlns:o="urn:schemas-microsoft-com:office:office" xmlns:oel="http://schemas.microsoft.com/office/2019/extlst" xmlns:r="http://schemas.openxmlformats.org/officeDocument/2006/relationships" xmlns:m="http://schemas.openxmlformats.org/officeDocument/2006/math" xmlns:v="urn:schemas-microsoft-com:vml" xmlns:wp14="http://schemas.microsoft.com/office/word/2010/wordprocessingDrawing" xmlns:wp="http://schemas.openxmlformats.org/drawingml/2006/wordprocessingDrawing" xmlns:w10="urn:schemas-microsoft-com:office:word" xmlns:w="http://schemas.openxmlformats.org/wordprocessingml/2006/main" xmlns:w14="http://schemas.microsoft.com/office/word/2010/wordml" xmlns:w15="http://schemas.microsoft.com/office/word/2012/wordml" xmlns:w16cex="http://schemas.microsoft.com/office/word/2018/wordml/cex" xmlns:w16cid="http://schemas.microsoft.com/office/word/2016/wordml/cid" xmlns:w16="http://schemas.microsoft.com/office/word/2018/wordml" xmlns:w16du="http://schemas.microsoft.com/office/word/2023/wordml/word16du" xmlns:w16sdtdh="http://schemas.microsoft.com/office/word/2020/wordml/sdtdatahash" xmlns:w16sdtfl="http://schemas.microsoft.com/office/word/2024/wordml/sdtformatlock" xmlns:w16se="http://schemas.microsoft.com/office/word/2015/wordml/symex" xmlns:wpg="http://schemas.microsoft.com/office/word/2010/wordprocessingGroup" xmlns:wpi="http://schemas.microsoft.com/office/word/2010/wordprocessingInk" xmlns:wne="http://schemas.microsoft.com/office/word/2006/wordml" xmlns:wps="http://schemas.microsoft.com/office/word/2010/wordprocessingShape" mc:Ignorable="w14 w15 w16se w16cid w16 w16cex w16sdtdh w16sdtfl w16du wp14">
+<w:footnotes xmlns:wpc="http://schemas.microsoft.com/office/word/2010/wordprocessingCanvas" xmlns:cx="http://schemas.microsoft.com/office/drawing/2014/chartex" xmlns:cx1="http://schemas.microsoft.com/office/drawing/2015/9/8/chartex" xmlns:mc="http://schemas.openxmlformats.org/markup-compatibility/2006" xmlns:o="urn:schemas-microsoft-com:office:office" xmlns:r="http://schemas.openxmlformats.org/officeDocument/2006/relationships" xmlns:m="http://schemas.openxmlformats.org/officeDocument/2006/math" xmlns:v="urn:schemas-microsoft-com:vml" xmlns:wp14="http://schemas.microsoft.com/office/word/2010/wordprocessingDrawing" xmlns:wp="http://schemas.openxmlformats.org/drawingml/2006/wordprocessingDrawing" xmlns:w10="urn:schemas-microsoft-com:office:word" xmlns:w="http://schemas.openxmlformats.org/wordprocessingml/2006/main" xmlns:w14="http://schemas.microsoft.com/office/word/2010/wordml" xmlns:w15="http://schemas.microsoft.com/office/word/2012/wordml" xmlns:w16se="http://schemas.microsoft.com/office/word/2015/wordml/symex" xmlns:wpg="http://schemas.microsoft.com/office/word/2010/wordprocessingGroup" xmlns:wpi="http://schemas.microsoft.com/office/word/2010/wordprocessingInk" xmlns:wne="http://schemas.microsoft.com/office/word/2006/wordml" xmlns:wps="http://schemas.microsoft.com/office/word/2010/wordprocessingShape" mc:Ignorable="w14 w15 w16se wp14">
   <w:footnote w:type="separator" w:id="-1">
     <w:p>
       <w:pPr>
@@ -826,7 +1217,7 @@
 </file>
 
 <file path=word/styles.xml><?xml version="1.0" encoding="utf-8"?>
-<w:styles xmlns:mc="http://schemas.openxmlformats.org/markup-compatibility/2006" xmlns:r="http://schemas.openxmlformats.org/officeDocument/2006/relationships" xmlns:w="http://schemas.openxmlformats.org/wordprocessingml/2006/main" xmlns:w14="http://schemas.microsoft.com/office/word/2010/wordml" xmlns:w15="http://schemas.microsoft.com/office/word/2012/wordml" xmlns:w16cex="http://schemas.microsoft.com/office/word/2018/wordml/cex" xmlns:w16cid="http://schemas.microsoft.com/office/word/2016/wordml/cid" xmlns:w16="http://schemas.microsoft.com/office/word/2018/wordml" xmlns:w16du="http://schemas.microsoft.com/office/word/2023/wordml/word16du" xmlns:w16sdtdh="http://schemas.microsoft.com/office/word/2020/wordml/sdtdatahash" xmlns:w16sdtfl="http://schemas.microsoft.com/office/word/2024/wordml/sdtformatlock" xmlns:w16se="http://schemas.microsoft.com/office/word/2015/wordml/symex" mc:Ignorable="w14 w15 w16se w16cid w16 w16cex w16sdtdh w16sdtfl w16du">
+<w:styles xmlns:mc="http://schemas.openxmlformats.org/markup-compatibility/2006" xmlns:r="http://schemas.openxmlformats.org/officeDocument/2006/relationships" xmlns:w="http://schemas.openxmlformats.org/wordprocessingml/2006/main" xmlns:w14="http://schemas.microsoft.com/office/word/2010/wordml" xmlns:w15="http://schemas.microsoft.com/office/word/2012/wordml" xmlns:w16se="http://schemas.microsoft.com/office/word/2015/wordml/symex" mc:Ignorable="w14 w15 w16se">
   <w:docDefaults>
     <w:rPrDefault>
       <w:rPr>
@@ -844,7 +1235,7 @@
       </w:pPr>
     </w:pPrDefault>
   </w:docDefaults>
-  <w:latentStyles w:defLockedState="0" w:defUIPriority="99" w:defSemiHidden="0" w:defUnhideWhenUsed="0" w:defQFormat="0" w:count="376">
+  <w:latentStyles w:defLockedState="0" w:defUIPriority="99" w:defSemiHidden="0" w:defUnhideWhenUsed="0" w:defQFormat="0" w:count="371">
     <w:lsdException w:name="Normal" w:uiPriority="0" w:qFormat="1"/>
     <w:lsdException w:name="heading 1" w:uiPriority="9" w:qFormat="1"/>
     <w:lsdException w:name="heading 2" w:semiHidden="1" w:uiPriority="9" w:unhideWhenUsed="1" w:qFormat="1"/>
@@ -1216,11 +1607,6 @@
     <w:lsdException w:name="List Table 5 Dark Accent 6" w:uiPriority="50"/>
     <w:lsdException w:name="List Table 6 Colorful Accent 6" w:uiPriority="51"/>
     <w:lsdException w:name="List Table 7 Colorful Accent 6" w:uiPriority="52"/>
-    <w:lsdException w:name="Mention" w:semiHidden="1" w:unhideWhenUsed="1"/>
-    <w:lsdException w:name="Smart Hyperlink" w:semiHidden="1" w:unhideWhenUsed="1"/>
-    <w:lsdException w:name="Hashtag" w:semiHidden="1" w:unhideWhenUsed="1"/>
-    <w:lsdException w:name="Unresolved Mention" w:semiHidden="1" w:unhideWhenUsed="1"/>
-    <w:lsdException w:name="Smart Link" w:semiHidden="1" w:unhideWhenUsed="1"/>
   </w:latentStyles>
   <w:style w:type="paragraph" w:default="1" w:styleId="Normal">
     <w:name w:val="Normal"/>

</xml_diff>

<commit_message>
Added the notes for pandas
</commit_message>
<xml_diff>
--- a/Day15(Learning Pandas)/Cheat Sheet for Pandas.docx
+++ b/Day15(Learning Pandas)/Cheat Sheet for Pandas.docx
@@ -604,8 +604,6 @@
           <w:szCs w:val="44"/>
         </w:rPr>
       </w:pPr>
-      <w:bookmarkStart w:id="0" w:name="_GoBack"/>
-      <w:bookmarkEnd w:id="0"/>
       <w:r>
         <w:rPr>
           <w:rFonts w:ascii="Amasis MT Pro Black" w:hAnsi="Amasis MT Pro Black"/>
@@ -1155,6 +1153,275 @@
           </wp:inline>
         </w:drawing>
       </w:r>
+    </w:p>
+    <w:p>
+      <w:pPr>
+        <w:rPr>
+          <w:rFonts w:ascii="Amasis MT Pro Black" w:hAnsi="Amasis MT Pro Black"/>
+          <w:b/>
+          <w:bCs/>
+          <w:color w:val="5B9BD5" w:themeColor="accent1"/>
+          <w:sz w:val="44"/>
+          <w:szCs w:val="44"/>
+        </w:rPr>
+      </w:pPr>
+    </w:p>
+    <w:p>
+      <w:pPr>
+        <w:rPr>
+          <w:rFonts w:ascii="Amasis MT Pro Black" w:hAnsi="Amasis MT Pro Black"/>
+          <w:b/>
+          <w:bCs/>
+          <w:color w:val="5B9BD5" w:themeColor="accent1"/>
+          <w:sz w:val="44"/>
+          <w:szCs w:val="44"/>
+        </w:rPr>
+      </w:pPr>
+    </w:p>
+    <w:p>
+      <w:pPr>
+        <w:rPr>
+          <w:rFonts w:ascii="Amasis MT Pro Black" w:hAnsi="Amasis MT Pro Black"/>
+          <w:b/>
+          <w:bCs/>
+          <w:color w:val="5B9BD5" w:themeColor="accent1"/>
+          <w:sz w:val="44"/>
+          <w:szCs w:val="44"/>
+        </w:rPr>
+      </w:pPr>
+    </w:p>
+    <w:p>
+      <w:pPr>
+        <w:rPr>
+          <w:rFonts w:ascii="Amasis MT Pro Black" w:hAnsi="Amasis MT Pro Black"/>
+          <w:b/>
+          <w:bCs/>
+          <w:color w:val="5B9BD5" w:themeColor="accent1"/>
+          <w:sz w:val="44"/>
+          <w:szCs w:val="44"/>
+        </w:rPr>
+      </w:pPr>
+    </w:p>
+    <w:p>
+      <w:pPr>
+        <w:jc w:val="center"/>
+        <w:rPr>
+          <w:rFonts w:ascii="Amasis MT Pro Black" w:hAnsi="Amasis MT Pro Black"/>
+          <w:b/>
+          <w:bCs/>
+          <w:noProof/>
+          <w:color w:val="5B9BD5" w:themeColor="accent1"/>
+          <w:sz w:val="44"/>
+          <w:szCs w:val="44"/>
+        </w:rPr>
+      </w:pPr>
+      <w:r>
+        <w:rPr>
+          <w:rFonts w:ascii="Amasis MT Pro Black" w:hAnsi="Amasis MT Pro Black"/>
+          <w:b/>
+          <w:bCs/>
+          <w:color w:val="5B9BD5" w:themeColor="accent1"/>
+          <w:sz w:val="44"/>
+          <w:szCs w:val="44"/>
+        </w:rPr>
+        <w:lastRenderedPageBreak/>
+        <w:t>Rename method:</w:t>
+      </w:r>
+      <w:r>
+        <w:rPr>
+          <w:rFonts w:ascii="Amasis MT Pro Black" w:hAnsi="Amasis MT Pro Black"/>
+          <w:b/>
+          <w:bCs/>
+          <w:noProof/>
+          <w:color w:val="5B9BD5" w:themeColor="accent1"/>
+          <w:sz w:val="44"/>
+          <w:szCs w:val="44"/>
+        </w:rPr>
+        <w:t xml:space="preserve"> </w:t>
+      </w:r>
+      <w:r>
+        <w:rPr>
+          <w:rFonts w:ascii="Amasis MT Pro Black" w:hAnsi="Amasis MT Pro Black"/>
+          <w:b/>
+          <w:bCs/>
+          <w:noProof/>
+          <w:color w:val="5B9BD5" w:themeColor="accent1"/>
+          <w:sz w:val="44"/>
+          <w:szCs w:val="44"/>
+        </w:rPr>
+        <w:drawing>
+          <wp:inline distT="0" distB="0" distL="0" distR="0" wp14:anchorId="7E891C0E" wp14:editId="6A62C93B">
+            <wp:extent cx="5943600" cy="2700652"/>
+            <wp:effectExtent l="0" t="0" r="0" b="5080"/>
+            <wp:docPr id="8" name="Picture 8"/>
+            <wp:cNvGraphicFramePr>
+              <a:graphicFrameLocks xmlns:a="http://schemas.openxmlformats.org/drawingml/2006/main" noChangeAspect="1"/>
+            </wp:cNvGraphicFramePr>
+            <a:graphic xmlns:a="http://schemas.openxmlformats.org/drawingml/2006/main">
+              <a:graphicData uri="http://schemas.openxmlformats.org/drawingml/2006/picture">
+                <pic:pic xmlns:pic="http://schemas.openxmlformats.org/drawingml/2006/picture">
+                  <pic:nvPicPr>
+                    <pic:cNvPr id="8" name="Screenshot 2025-07-20 150701.png"/>
+                    <pic:cNvPicPr/>
+                  </pic:nvPicPr>
+                  <pic:blipFill>
+                    <a:blip r:embed="rId22">
+                      <a:extLst>
+                        <a:ext uri="{28A0092B-C50C-407E-A947-70E740481C1C}">
+                          <a14:useLocalDpi xmlns:a14="http://schemas.microsoft.com/office/drawing/2010/main" val="0"/>
+                        </a:ext>
+                      </a:extLst>
+                    </a:blip>
+                    <a:stretch>
+                      <a:fillRect/>
+                    </a:stretch>
+                  </pic:blipFill>
+                  <pic:spPr>
+                    <a:xfrm>
+                      <a:off x="0" y="0"/>
+                      <a:ext cx="5943600" cy="2700652"/>
+                    </a:xfrm>
+                    <a:prstGeom prst="rect">
+                      <a:avLst/>
+                    </a:prstGeom>
+                  </pic:spPr>
+                </pic:pic>
+              </a:graphicData>
+            </a:graphic>
+          </wp:inline>
+        </w:drawing>
+      </w:r>
+    </w:p>
+    <w:p>
+      <w:pPr>
+        <w:rPr>
+          <w:rFonts w:ascii="Amasis MT Pro Black" w:hAnsi="Amasis MT Pro Black"/>
+          <w:b/>
+          <w:bCs/>
+          <w:color w:val="5B9BD5" w:themeColor="accent1"/>
+          <w:sz w:val="44"/>
+          <w:szCs w:val="44"/>
+        </w:rPr>
+      </w:pPr>
+      <w:bookmarkStart w:id="0" w:name="_GoBack"/>
+      <w:bookmarkEnd w:id="0"/>
+      <w:r>
+        <w:rPr>
+          <w:rFonts w:ascii="Amasis MT Pro Black" w:hAnsi="Amasis MT Pro Black"/>
+          <w:b/>
+          <w:bCs/>
+          <w:noProof/>
+          <w:color w:val="5B9BD5" w:themeColor="accent1"/>
+          <w:sz w:val="44"/>
+          <w:szCs w:val="44"/>
+        </w:rPr>
+        <w:lastRenderedPageBreak/>
+        <w:drawing>
+          <wp:inline distT="0" distB="0" distL="0" distR="0" wp14:anchorId="56D9D439" wp14:editId="6ACED7C3">
+            <wp:extent cx="5960853" cy="3094111"/>
+            <wp:effectExtent l="0" t="0" r="1905" b="0"/>
+            <wp:docPr id="9" name="Picture 9"/>
+            <wp:cNvGraphicFramePr>
+              <a:graphicFrameLocks xmlns:a="http://schemas.openxmlformats.org/drawingml/2006/main" noChangeAspect="1"/>
+            </wp:cNvGraphicFramePr>
+            <a:graphic xmlns:a="http://schemas.openxmlformats.org/drawingml/2006/main">
+              <a:graphicData uri="http://schemas.openxmlformats.org/drawingml/2006/picture">
+                <pic:pic xmlns:pic="http://schemas.openxmlformats.org/drawingml/2006/picture">
+                  <pic:nvPicPr>
+                    <pic:cNvPr id="9" name="Screenshot 2025-07-20 150715.png"/>
+                    <pic:cNvPicPr/>
+                  </pic:nvPicPr>
+                  <pic:blipFill>
+                    <a:blip r:embed="rId23">
+                      <a:extLst>
+                        <a:ext uri="{28A0092B-C50C-407E-A947-70E740481C1C}">
+                          <a14:useLocalDpi xmlns:a14="http://schemas.microsoft.com/office/drawing/2010/main" val="0"/>
+                        </a:ext>
+                      </a:extLst>
+                    </a:blip>
+                    <a:stretch>
+                      <a:fillRect/>
+                    </a:stretch>
+                  </pic:blipFill>
+                  <pic:spPr>
+                    <a:xfrm>
+                      <a:off x="0" y="0"/>
+                      <a:ext cx="5976107" cy="3102029"/>
+                    </a:xfrm>
+                    <a:prstGeom prst="rect">
+                      <a:avLst/>
+                    </a:prstGeom>
+                  </pic:spPr>
+                </pic:pic>
+              </a:graphicData>
+            </a:graphic>
+          </wp:inline>
+        </w:drawing>
+      </w:r>
+      <w:r>
+        <w:rPr>
+          <w:rFonts w:ascii="Amasis MT Pro Black" w:hAnsi="Amasis MT Pro Black"/>
+          <w:b/>
+          <w:bCs/>
+          <w:noProof/>
+          <w:color w:val="5B9BD5" w:themeColor="accent1"/>
+          <w:sz w:val="44"/>
+          <w:szCs w:val="44"/>
+        </w:rPr>
+        <w:drawing>
+          <wp:inline distT="0" distB="0" distL="0" distR="0" wp14:anchorId="514AEA14" wp14:editId="70DD27FB">
+            <wp:extent cx="5943600" cy="3493135"/>
+            <wp:effectExtent l="0" t="0" r="0" b="0"/>
+            <wp:docPr id="10" name="Picture 10"/>
+            <wp:cNvGraphicFramePr>
+              <a:graphicFrameLocks xmlns:a="http://schemas.openxmlformats.org/drawingml/2006/main" noChangeAspect="1"/>
+            </wp:cNvGraphicFramePr>
+            <a:graphic xmlns:a="http://schemas.openxmlformats.org/drawingml/2006/main">
+              <a:graphicData uri="http://schemas.openxmlformats.org/drawingml/2006/picture">
+                <pic:pic xmlns:pic="http://schemas.openxmlformats.org/drawingml/2006/picture">
+                  <pic:nvPicPr>
+                    <pic:cNvPr id="10" name="Screenshot 2025-07-20 150730.png"/>
+                    <pic:cNvPicPr/>
+                  </pic:nvPicPr>
+                  <pic:blipFill>
+                    <a:blip r:embed="rId24">
+                      <a:extLst>
+                        <a:ext uri="{28A0092B-C50C-407E-A947-70E740481C1C}">
+                          <a14:useLocalDpi xmlns:a14="http://schemas.microsoft.com/office/drawing/2010/main" val="0"/>
+                        </a:ext>
+                      </a:extLst>
+                    </a:blip>
+                    <a:stretch>
+                      <a:fillRect/>
+                    </a:stretch>
+                  </pic:blipFill>
+                  <pic:spPr>
+                    <a:xfrm>
+                      <a:off x="0" y="0"/>
+                      <a:ext cx="5943600" cy="3493135"/>
+                    </a:xfrm>
+                    <a:prstGeom prst="rect">
+                      <a:avLst/>
+                    </a:prstGeom>
+                  </pic:spPr>
+                </pic:pic>
+              </a:graphicData>
+            </a:graphic>
+          </wp:inline>
+        </w:drawing>
+      </w:r>
+    </w:p>
+    <w:p>
+      <w:pPr>
+        <w:rPr>
+          <w:rFonts w:ascii="Amasis MT Pro Black" w:hAnsi="Amasis MT Pro Black"/>
+          <w:b/>
+          <w:bCs/>
+          <w:color w:val="5B9BD5" w:themeColor="accent1"/>
+          <w:sz w:val="44"/>
+          <w:szCs w:val="44"/>
+        </w:rPr>
+      </w:pPr>
     </w:p>
     <w:sectPr>
       <w:pgSz w:w="12240" w:h="15840"/>

</xml_diff>